<commit_message>
Added AWS Media Pipeline project folder
</commit_message>
<xml_diff>
--- a/Updated_Resume_IT_KP.docx
+++ b/Updated_Resume_IT_KP.docx
@@ -3,6 +3,12 @@
 <w:document xmlns:wpc="http://schemas.microsoft.com/office/word/2010/wordprocessingCanvas" xmlns:cx="http://schemas.microsoft.com/office/drawing/2014/chartex" xmlns:cx1="http://schemas.microsoft.com/office/drawing/2015/9/8/chartex" xmlns:cx2="http://schemas.microsoft.com/office/drawing/2015/10/21/chartex" xmlns:cx3="http://schemas.microsoft.com/office/drawing/2016/5/9/chartex" xmlns:cx4="http://schemas.microsoft.com/office/drawing/2016/5/10/chartex" xmlns:cx5="http://schemas.microsoft.com/office/drawing/2016/5/11/chartex" xmlns:cx6="http://schemas.microsoft.com/office/drawing/2016/5/12/chartex" xmlns:cx7="http://schemas.microsoft.com/office/drawing/2016/5/13/chartex" xmlns:cx8="http://schemas.microsoft.com/office/drawing/2016/5/14/chartex" xmlns:mc="http://schemas.openxmlformats.org/markup-compatibility/2006" xmlns:aink="http://schemas.microsoft.com/office/drawing/2016/ink" xmlns:am3d="http://schemas.microsoft.com/office/drawing/2017/model3d" xmlns:o="urn:schemas-microsoft-com:office:office" xmlns:oel="http://schemas.microsoft.com/office/2019/extlst" xmlns:r="http://schemas.openxmlformats.org/officeDocument/2006/relationships" xmlns:m="http://schemas.openxmlformats.org/officeDocument/2006/math" xmlns:v="urn:schemas-microsoft-com:vml" xmlns:wp14="http://schemas.microsoft.com/office/word/2010/wordprocessingDrawing" xmlns:wp="http://schemas.openxmlformats.org/drawingml/2006/wordprocessingDrawing" xmlns:w10="urn:schemas-microsoft-com:office:word" xmlns:w="http://schemas.openxmlformats.org/wordprocessingml/2006/main" xmlns:w14="http://schemas.microsoft.com/office/word/2010/wordml" xmlns:w15="http://schemas.microsoft.com/office/word/2012/wordml" xmlns:w16cex="http://schemas.microsoft.com/office/word/2018/wordml/cex" xmlns:w16cid="http://schemas.microsoft.com/office/word/2016/wordml/cid" xmlns:w16="http://schemas.microsoft.com/office/word/2018/wordml" xmlns:w16du="http://schemas.microsoft.com/office/word/2023/wordml/word16du" xmlns:w16sdtdh="http://schemas.microsoft.com/office/word/2020/wordml/sdtdatahash" xmlns:w16se="http://schemas.microsoft.com/office/word/2015/wordml/symex" xmlns:wpg="http://schemas.microsoft.com/office/word/2010/wordprocessingGroup" xmlns:wpi="http://schemas.microsoft.com/office/word/2010/wordprocessingInk" xmlns:wne="http://schemas.microsoft.com/office/word/2006/wordml" xmlns:wps="http://schemas.microsoft.com/office/word/2010/wordprocessingShape" mc:Ignorable="w14 w15 w16se w16cid w16 w16cex w16sdtdh w16du wp14">
   <w:body>
     <w:p>
+      <w:pPr>
+        <w:rPr>
+          <w:color w:val="467886" w:themeColor="hyperlink"/>
+          <w:u w:val="single"/>
+        </w:rPr>
+      </w:pPr>
       <w:r>
         <w:rPr>
           <w:b/>
@@ -60,25 +66,7 @@
           <w:rPr>
             <w:rStyle w:val="Hyperlink"/>
           </w:rPr>
-          <w:t>Link</w:t>
-        </w:r>
-        <w:r>
-          <w:rPr>
-            <w:rStyle w:val="Hyperlink"/>
-          </w:rPr>
-          <w:t>e</w:t>
-        </w:r>
-        <w:r>
-          <w:rPr>
-            <w:rStyle w:val="Hyperlink"/>
-          </w:rPr>
-          <w:t>d</w:t>
-        </w:r>
-        <w:r>
-          <w:rPr>
-            <w:rStyle w:val="Hyperlink"/>
-          </w:rPr>
-          <w:t>In</w:t>
+          <w:t>LinkedIn</w:t>
         </w:r>
       </w:hyperlink>
     </w:p>
@@ -87,8 +75,11 @@
         <w:t xml:space="preserve">                                                                                                                                    </w:t>
       </w:r>
       <w:r>
+        <w:rPr>
+          <w:noProof/>
+        </w:rPr>
         <w:drawing>
-          <wp:anchor distT="0" distB="0" distL="114300" distR="114300" simplePos="0" relativeHeight="251658240" behindDoc="0" locked="0" layoutInCell="1" allowOverlap="1" wp14:anchorId="3BD0896C" wp14:editId="199BE7EE">
+          <wp:anchor distT="0" distB="0" distL="114300" distR="114300" simplePos="0" relativeHeight="251658240" behindDoc="0" locked="0" layoutInCell="1" allowOverlap="1" wp14:anchorId="3BD0896C" wp14:editId="43B92C41">
             <wp:simplePos x="0" y="0"/>
             <wp:positionH relativeFrom="margin">
               <wp:align>right</wp:align>
@@ -174,13 +165,7 @@
     </w:p>
     <w:p>
       <w:r>
-        <w:t xml:space="preserve">Motivated and reliable </w:t>
-      </w:r>
-      <w:r>
-        <w:t>master’s</w:t>
-      </w:r>
-      <w:r>
-        <w:t xml:space="preserve"> graduate in Information Technology (Cybersecurity) with hands-on experience in IT infrastructure design, troubleshooting, and cloud cost optimization. Currently preparing for CompTIA Security+ and Network+ certifications. Seeking an entry-level IT Support role to apply strong problem-solving skills, excellent customer service experience, and a solid foundation in systems and networking within a collaborative technical environment.</w:t>
+        <w:t>Motivated and reliable master’s graduate in Information Technology (Cybersecurity) with hands-on experience in IT infrastructure design, troubleshooting, and cloud cost optimization. Currently preparing for CompTIA Security+ and Network+ certifications. Seeking an entry-level IT Support role to apply strong problem-solving skills, excellent customer service experience, and a solid foundation in systems and networking within a collaborative technical environment.</w:t>
       </w:r>
     </w:p>
     <w:p>
@@ -692,10 +677,7 @@
         </w:numPr>
       </w:pPr>
       <w:r>
-        <w:t>Analysed</w:t>
-      </w:r>
-      <w:r>
-        <w:t xml:space="preserve"> cloud infrastructure to design a cost-saving model for XC3 Company.</w:t>
+        <w:t>Analysed cloud infrastructure to design a cost-saving model for XC3 Company.</w:t>
       </w:r>
     </w:p>
     <w:p>
@@ -3165,6 +3147,7 @@
   <w:style w:type="character" w:default="1" w:styleId="DefaultParagraphFont">
     <w:name w:val="Default Paragraph Font"/>
     <w:uiPriority w:val="1"/>
+    <w:semiHidden/>
     <w:unhideWhenUsed/>
   </w:style>
   <w:style w:type="table" w:default="1" w:styleId="TableNormal">

</xml_diff>